<commit_message>
revisions in response to review
</commit_message>
<xml_diff>
--- a/docs/graphs-tables.docx
+++ b/docs/graphs-tables.docx
@@ -62,7 +62,7 @@
               <w:jc w:val="center"/>
             </w:pPr>
             <w:pPr>
-              <w:jc w:val="start"/>
+              <w:jc w:val="left"/>
               <w:spacing w:before="200"/>
               <w:pStyle w:val="ImageCaption"/>
             </w:pPr>
@@ -78,19 +78,20 @@
               <w:tblLook w:firstRow="1" w:lastRow="0" w:firstColumn="0" w:lastColumn="0" w:noHBand="0" w:noVBand="0" w:val="0020"/>
             </w:tblPr>
             <w:tblGrid>
-              <w:gridCol w:w="600"/>
-              <w:gridCol w:w="600"/>
-              <w:gridCol w:w="657"/>
-              <w:gridCol w:w="571"/>
-              <w:gridCol w:w="829"/>
-              <w:gridCol w:w="400"/>
-              <w:gridCol w:w="571"/>
-              <w:gridCol w:w="571"/>
               <w:gridCol w:w="486"/>
-              <w:gridCol w:w="686"/>
-              <w:gridCol w:w="657"/>
-              <w:gridCol w:w="486"/>
-              <w:gridCol w:w="800"/>
+              <w:gridCol w:w="567"/>
+              <w:gridCol w:w="567"/>
+              <w:gridCol w:w="621"/>
+              <w:gridCol w:w="540"/>
+              <w:gridCol w:w="783"/>
+              <w:gridCol w:w="324"/>
+              <w:gridCol w:w="540"/>
+              <w:gridCol w:w="540"/>
+              <w:gridCol w:w="459"/>
+              <w:gridCol w:w="648"/>
+              <w:gridCol w:w="621"/>
+              <w:gridCol w:w="459"/>
+              <w:gridCol w:w="756"/>
             </w:tblGrid>
             <w:tr>
               <w:trPr>
@@ -101,6 +102,19 @@
                 <w:p>
                   <w:pPr>
                     <w:pStyle w:val="Compact"/>
+                    <w:jc w:val="right"/>
+                    <w:jc w:val="center"/>
+                  </w:pPr>
+                  <w:r>
+                    <w:t xml:space="preserve">Deployment Number</w:t>
+                  </w:r>
+                </w:p>
+              </w:tc>
+              <w:tc>
+                <w:tcPr/>
+                <w:p>
+                  <w:pPr>
+                    <w:pStyle w:val="Compact"/>
                     <w:jc w:val="left"/>
                     <w:jc w:val="center"/>
                   </w:pPr>
@@ -170,7 +184,7 @@
                     <w:jc w:val="center"/>
                   </w:pPr>
                   <w:r>
-                    <w:t xml:space="preserve">N Dive Cycles</w:t>
+                    <w:t xml:space="preserve">Dive Cycles</w:t>
                   </w:r>
                 </w:p>
               </w:tc>
@@ -272,6 +286,19 @@
                 <w:p>
                   <w:pPr>
                     <w:pStyle w:val="Compact"/>
+                    <w:jc w:val="right"/>
+                    <w:jc w:val="center"/>
+                  </w:pPr>
+                  <w:r>
+                    <w:t xml:space="preserve">1</w:t>
+                  </w:r>
+                </w:p>
+              </w:tc>
+              <w:tc>
+                <w:tcPr/>
+                <w:p>
+                  <w:pPr>
+                    <w:pStyle w:val="Compact"/>
                     <w:jc w:val="left"/>
                     <w:jc w:val="center"/>
                   </w:pPr>
@@ -443,6 +470,19 @@
                 <w:p>
                   <w:pPr>
                     <w:pStyle w:val="Compact"/>
+                    <w:jc w:val="right"/>
+                    <w:jc w:val="center"/>
+                  </w:pPr>
+                  <w:r>
+                    <w:t xml:space="preserve">2</w:t>
+                  </w:r>
+                </w:p>
+              </w:tc>
+              <w:tc>
+                <w:tcPr/>
+                <w:p>
+                  <w:pPr>
+                    <w:pStyle w:val="Compact"/>
                     <w:jc w:val="left"/>
                     <w:jc w:val="center"/>
                   </w:pPr>
@@ -614,6 +654,19 @@
                 <w:p>
                   <w:pPr>
                     <w:pStyle w:val="Compact"/>
+                    <w:jc w:val="right"/>
+                    <w:jc w:val="center"/>
+                  </w:pPr>
+                  <w:r>
+                    <w:t xml:space="preserve">3</w:t>
+                  </w:r>
+                </w:p>
+              </w:tc>
+              <w:tc>
+                <w:tcPr/>
+                <w:p>
+                  <w:pPr>
+                    <w:pStyle w:val="Compact"/>
                     <w:jc w:val="left"/>
                     <w:jc w:val="center"/>
                   </w:pPr>
@@ -785,6 +838,19 @@
                 <w:p>
                   <w:pPr>
                     <w:pStyle w:val="Compact"/>
+                    <w:jc w:val="right"/>
+                    <w:jc w:val="center"/>
+                  </w:pPr>
+                  <w:r>
+                    <w:t xml:space="preserve">4</w:t>
+                  </w:r>
+                </w:p>
+              </w:tc>
+              <w:tc>
+                <w:tcPr/>
+                <w:p>
+                  <w:pPr>
+                    <w:pStyle w:val="Compact"/>
                     <w:jc w:val="left"/>
                     <w:jc w:val="center"/>
                   </w:pPr>
@@ -956,6 +1022,19 @@
                 <w:p>
                   <w:pPr>
                     <w:pStyle w:val="Compact"/>
+                    <w:jc w:val="right"/>
+                    <w:jc w:val="center"/>
+                  </w:pPr>
+                  <w:r>
+                    <w:t xml:space="preserve">5</w:t>
+                  </w:r>
+                </w:p>
+              </w:tc>
+              <w:tc>
+                <w:tcPr/>
+                <w:p>
+                  <w:pPr>
+                    <w:pStyle w:val="Compact"/>
                     <w:jc w:val="left"/>
                     <w:jc w:val="center"/>
                   </w:pPr>
@@ -1127,6 +1206,19 @@
                 <w:p>
                   <w:pPr>
                     <w:pStyle w:val="Compact"/>
+                    <w:jc w:val="right"/>
+                    <w:jc w:val="center"/>
+                  </w:pPr>
+                  <w:r>
+                    <w:t xml:space="preserve">6</w:t>
+                  </w:r>
+                </w:p>
+              </w:tc>
+              <w:tc>
+                <w:tcPr/>
+                <w:p>
+                  <w:pPr>
+                    <w:pStyle w:val="Compact"/>
                     <w:jc w:val="left"/>
                     <w:jc w:val="center"/>
                   </w:pPr>
@@ -1298,6 +1390,19 @@
                 <w:p>
                   <w:pPr>
                     <w:pStyle w:val="Compact"/>
+                    <w:jc w:val="right"/>
+                    <w:jc w:val="center"/>
+                  </w:pPr>
+                  <w:r>
+                    <w:t xml:space="preserve">7</w:t>
+                  </w:r>
+                </w:p>
+              </w:tc>
+              <w:tc>
+                <w:tcPr/>
+                <w:p>
+                  <w:pPr>
+                    <w:pStyle w:val="Compact"/>
                     <w:jc w:val="left"/>
                     <w:jc w:val="center"/>
                   </w:pPr>
@@ -1469,6 +1574,19 @@
                 <w:p>
                   <w:pPr>
                     <w:pStyle w:val="Compact"/>
+                    <w:jc w:val="right"/>
+                    <w:jc w:val="center"/>
+                  </w:pPr>
+                  <w:r>
+                    <w:t xml:space="preserve">8</w:t>
+                  </w:r>
+                </w:p>
+              </w:tc>
+              <w:tc>
+                <w:tcPr/>
+                <w:p>
+                  <w:pPr>
+                    <w:pStyle w:val="Compact"/>
                     <w:jc w:val="left"/>
                     <w:jc w:val="center"/>
                   </w:pPr>
@@ -1640,6 +1758,19 @@
                 <w:p>
                   <w:pPr>
                     <w:pStyle w:val="Compact"/>
+                    <w:jc w:val="right"/>
+                    <w:jc w:val="center"/>
+                  </w:pPr>
+                  <w:r>
+                    <w:t xml:space="preserve">9</w:t>
+                  </w:r>
+                </w:p>
+              </w:tc>
+              <w:tc>
+                <w:tcPr/>
+                <w:p>
+                  <w:pPr>
+                    <w:pStyle w:val="Compact"/>
                     <w:jc w:val="left"/>
                     <w:jc w:val="center"/>
                   </w:pPr>
@@ -1811,6 +1942,19 @@
                 <w:p>
                   <w:pPr>
                     <w:pStyle w:val="Compact"/>
+                    <w:jc w:val="right"/>
+                    <w:jc w:val="center"/>
+                  </w:pPr>
+                  <w:r>
+                    <w:t xml:space="preserve">10</w:t>
+                  </w:r>
+                </w:p>
+              </w:tc>
+              <w:tc>
+                <w:tcPr/>
+                <w:p>
+                  <w:pPr>
+                    <w:pStyle w:val="Compact"/>
                     <w:jc w:val="left"/>
                     <w:jc w:val="center"/>
                   </w:pPr>
@@ -1982,6 +2126,19 @@
                 <w:p>
                   <w:pPr>
                     <w:pStyle w:val="Compact"/>
+                    <w:jc w:val="right"/>
+                    <w:jc w:val="center"/>
+                  </w:pPr>
+                  <w:r>
+                    <w:t xml:space="preserve">11</w:t>
+                  </w:r>
+                </w:p>
+              </w:tc>
+              <w:tc>
+                <w:tcPr/>
+                <w:p>
+                  <w:pPr>
+                    <w:pStyle w:val="Compact"/>
                     <w:jc w:val="left"/>
                     <w:jc w:val="center"/>
                   </w:pPr>
@@ -2153,6 +2310,19 @@
                 <w:p>
                   <w:pPr>
                     <w:pStyle w:val="Compact"/>
+                    <w:jc w:val="right"/>
+                    <w:jc w:val="center"/>
+                  </w:pPr>
+                  <w:r>
+                    <w:t xml:space="preserve">12</w:t>
+                  </w:r>
+                </w:p>
+              </w:tc>
+              <w:tc>
+                <w:tcPr/>
+                <w:p>
+                  <w:pPr>
+                    <w:pStyle w:val="Compact"/>
                     <w:jc w:val="left"/>
                     <w:jc w:val="center"/>
                   </w:pPr>
@@ -2324,6 +2494,19 @@
                 <w:p>
                   <w:pPr>
                     <w:pStyle w:val="Compact"/>
+                    <w:jc w:val="right"/>
+                    <w:jc w:val="center"/>
+                  </w:pPr>
+                  <w:r>
+                    <w:t xml:space="preserve">13</w:t>
+                  </w:r>
+                </w:p>
+              </w:tc>
+              <w:tc>
+                <w:tcPr/>
+                <w:p>
+                  <w:pPr>
+                    <w:pStyle w:val="Compact"/>
                     <w:jc w:val="left"/>
                     <w:jc w:val="center"/>
                   </w:pPr>
@@ -2490,6 +2673,19 @@
               </w:tc>
             </w:tr>
             <w:tr>
+              <w:tc>
+                <w:tcPr/>
+                <w:p>
+                  <w:pPr>
+                    <w:pStyle w:val="Compact"/>
+                    <w:jc w:val="right"/>
+                    <w:jc w:val="center"/>
+                  </w:pPr>
+                  <w:r>
+                    <w:t xml:space="preserve">NA</w:t>
+                  </w:r>
+                </w:p>
+              </w:tc>
               <w:tc>
                 <w:tcPr/>
                 <w:p>
@@ -2703,7 +2899,7 @@
               <w:jc w:val="center"/>
             </w:pPr>
             <w:pPr>
-              <w:jc w:val="start"/>
+              <w:jc w:val="left"/>
               <w:spacing w:before="200"/>
               <w:pStyle w:val="ImageCaption"/>
             </w:pPr>
@@ -4309,7 +4505,7 @@
               <w:jc w:val="center"/>
             </w:pPr>
             <w:pPr>
-              <w:jc w:val="start"/>
+              <w:jc w:val="left"/>
               <w:spacing w:before="200"/>
               <w:pStyle w:val="ImageCaption"/>
             </w:pPr>
@@ -4397,7 +4593,7 @@
               <w:jc w:val="center"/>
             </w:pPr>
             <w:pPr>
-              <w:jc w:val="start"/>
+              <w:jc w:val="left"/>
               <w:spacing w:before="200"/>
               <w:pStyle w:val="ImageCaption"/>
             </w:pPr>
@@ -4495,7 +4691,7 @@
               <w:jc w:val="center"/>
             </w:pPr>
             <w:pPr>
-              <w:jc w:val="start"/>
+              <w:jc w:val="left"/>
               <w:spacing w:before="200"/>
               <w:pStyle w:val="ImageCaption"/>
             </w:pPr>
@@ -4583,7 +4779,7 @@
               <w:jc w:val="center"/>
             </w:pPr>
             <w:pPr>
-              <w:jc w:val="start"/>
+              <w:jc w:val="left"/>
               <w:spacing w:before="200"/>
               <w:pStyle w:val="ImageCaption"/>
             </w:pPr>
@@ -4688,7 +4884,7 @@
               <w:jc w:val="center"/>
             </w:pPr>
             <w:pPr>
-              <w:jc w:val="start"/>
+              <w:jc w:val="left"/>
               <w:spacing w:before="200"/>
               <w:pStyle w:val="ImageCaption"/>
             </w:pPr>

</xml_diff>